<commit_message>
docs: add stage 0 completion report and refresh Word package
</commit_message>
<xml_diff>
--- a/docs/word/00-register/01-register-dokumentacii.docx
+++ b/docs/word/00-register/01-register-dokumentacii.docx
@@ -3503,6 +3503,134 @@
                 <w:sz w:val="18"/>
               </w:rPr>
               <w:t>Техлид</w:t>
+            </w:r>
+          </w:p>
+        </w:tc>
+      </w:tr>
+      <w:tr>
+        <w:tc>
+          <w:tcPr>
+            <w:tcW w:type="dxa" w:w="1662"/>
+          </w:tcPr>
+          <w:p>
+            <w:pPr>
+              <w:spacing w:after="20"/>
+            </w:pPr>
+            <w:r>
+              <w:rPr>
+                <w:sz w:val="18"/>
+              </w:rPr>
+            </w:r>
+            <w:r>
+              <w:rPr>
+                <w:sz w:val="18"/>
+              </w:rPr>
+              <w:t>23</w:t>
+            </w:r>
+          </w:p>
+        </w:tc>
+        <w:tc>
+          <w:tcPr>
+            <w:tcW w:type="dxa" w:w="1662"/>
+          </w:tcPr>
+          <w:p>
+            <w:pPr>
+              <w:spacing w:after="20"/>
+            </w:pPr>
+            <w:r>
+              <w:rPr>
+                <w:sz w:val="18"/>
+              </w:rPr>
+            </w:r>
+            <w:r>
+              <w:rPr>
+                <w:sz w:val="18"/>
+              </w:rPr>
+              <w:t>ШК-10-05</w:t>
+            </w:r>
+          </w:p>
+        </w:tc>
+        <w:tc>
+          <w:tcPr>
+            <w:tcW w:type="dxa" w:w="1662"/>
+          </w:tcPr>
+          <w:p>
+            <w:pPr>
+              <w:spacing w:after="20"/>
+            </w:pPr>
+            <w:r>
+              <w:rPr>
+                <w:sz w:val="18"/>
+              </w:rPr>
+            </w:r>
+            <w:r>
+              <w:rPr>
+                <w:sz w:val="18"/>
+              </w:rPr>
+              <w:t>Отчёт о завершении этапа 0</w:t>
+            </w:r>
+          </w:p>
+        </w:tc>
+        <w:tc>
+          <w:tcPr>
+            <w:tcW w:type="dxa" w:w="1662"/>
+          </w:tcPr>
+          <w:p>
+            <w:pPr>
+              <w:spacing w:after="20"/>
+            </w:pPr>
+            <w:r>
+              <w:rPr>
+                <w:sz w:val="18"/>
+              </w:rPr>
+            </w:r>
+            <w:r>
+              <w:rPr>
+                <w:sz w:val="18"/>
+              </w:rPr>
+              <w:t>0.1</w:t>
+            </w:r>
+          </w:p>
+        </w:tc>
+        <w:tc>
+          <w:tcPr>
+            <w:tcW w:type="dxa" w:w="1662"/>
+          </w:tcPr>
+          <w:p>
+            <w:pPr>
+              <w:spacing w:after="20"/>
+            </w:pPr>
+            <w:r>
+              <w:rPr>
+                <w:sz w:val="18"/>
+              </w:rPr>
+            </w:r>
+            <w:r>
+              <w:rPr>
+                <w:sz w:val="18"/>
+              </w:rPr>
+              <w:t>Черновик</w:t>
+            </w:r>
+          </w:p>
+        </w:tc>
+        <w:tc>
+          <w:tcPr>
+            <w:tcW w:type="dxa" w:w="1662"/>
+          </w:tcPr>
+          <w:p>
+            <w:pPr>
+              <w:spacing w:after="20"/>
+            </w:pPr>
+            <w:r>
+              <w:rPr>
+                <w:sz w:val="18"/>
+              </w:rPr>
+            </w:r>
+            <w:r>
+              <w:rPr>
+                <w:sz w:val="18"/>
+              </w:rPr>
+              <w:t>РП</w:t>
             </w:r>
           </w:p>
         </w:tc>

</xml_diff>

<commit_message>
feat: add FastAPI pilot backend, JWT RBAC multi-tenancy and migration map
</commit_message>
<xml_diff>
--- a/docs/word/00-register/01-register-dokumentacii.docx
+++ b/docs/word/00-register/01-register-dokumentacii.docx
@@ -365,7 +365,7 @@
               <w:rPr>
                 <w:sz w:val="18"/>
               </w:rPr>
-              <w:t>0.1</w:t>
+              <w:t>0.2</w:t>
             </w:r>
           </w:p>
         </w:tc>
@@ -409,7 +409,7 @@
               <w:rPr>
                 <w:sz w:val="18"/>
               </w:rPr>
-              <w:t>Черновик</w:t>
+              <w:t>Рабочий</w:t>
             </w:r>
           </w:p>
         </w:tc>
@@ -1540,7 +1540,7 @@
               <w:rPr>
                 <w:sz w:val="18"/>
               </w:rPr>
-              <w:t>0.1</w:t>
+              <w:t>0.2</w:t>
             </w:r>
           </w:p>
         </w:tc>
@@ -1561,7 +1561,7 @@
               <w:rPr>
                 <w:sz w:val="18"/>
               </w:rPr>
-              <w:t>Черновик</w:t>
+              <w:t>Рабочий</w:t>
             </w:r>
           </w:p>
         </w:tc>
@@ -1861,7 +1861,7 @@
               <w:rPr>
                 <w:sz w:val="18"/>
               </w:rPr>
-              <w:t>10</w:t>
+              <w:t>9.1</w:t>
             </w:r>
           </w:p>
         </w:tc>
@@ -1882,7 +1882,7 @@
               <w:rPr>
                 <w:sz w:val="18"/>
               </w:rPr>
-              <w:t>ШК-04-01</w:t>
+              <w:t>ШК-03-03</w:t>
             </w:r>
           </w:p>
         </w:tc>
@@ -1903,7 +1903,7 @@
               <w:rPr>
                 <w:sz w:val="18"/>
               </w:rPr>
-              <w:t>Модель данных</w:t>
+              <w:t>API пилотного контура</w:t>
             </w:r>
           </w:p>
         </w:tc>
@@ -1945,7 +1945,7 @@
               <w:rPr>
                 <w:sz w:val="18"/>
               </w:rPr>
-              <w:t>Черновик</w:t>
+              <w:t>Рабочий</w:t>
             </w:r>
           </w:p>
         </w:tc>
@@ -1966,7 +1966,7 @@
               <w:rPr>
                 <w:sz w:val="18"/>
               </w:rPr>
-              <w:t>Архитектор БД</w:t>
+              <w:t>Архитектор</w:t>
             </w:r>
           </w:p>
         </w:tc>
@@ -1989,7 +1989,7 @@
               <w:rPr>
                 <w:sz w:val="18"/>
               </w:rPr>
-              <w:t>11</w:t>
+              <w:t>10</w:t>
             </w:r>
           </w:p>
         </w:tc>
@@ -2010,7 +2010,7 @@
               <w:rPr>
                 <w:sz w:val="18"/>
               </w:rPr>
-              <w:t>ШК-05-01</w:t>
+              <w:t>ШК-04-01</w:t>
             </w:r>
           </w:p>
         </w:tc>
@@ -2031,7 +2031,7 @@
               <w:rPr>
                 <w:sz w:val="18"/>
               </w:rPr>
-              <w:t>Концепция информационной безопасности</w:t>
+              <w:t>Модель данных</w:t>
             </w:r>
           </w:p>
         </w:tc>
@@ -2094,7 +2094,7 @@
               <w:rPr>
                 <w:sz w:val="18"/>
               </w:rPr>
-              <w:t>ИБ</w:t>
+              <w:t>Архитектор БД</w:t>
             </w:r>
           </w:p>
         </w:tc>
@@ -2117,7 +2117,7 @@
               <w:rPr>
                 <w:sz w:val="18"/>
               </w:rPr>
-              <w:t>12</w:t>
+              <w:t>11</w:t>
             </w:r>
           </w:p>
         </w:tc>
@@ -2138,7 +2138,7 @@
               <w:rPr>
                 <w:sz w:val="18"/>
               </w:rPr>
-              <w:t>ШК-06-01</w:t>
+              <w:t>ШК-05-01</w:t>
             </w:r>
           </w:p>
         </w:tc>
@@ -2159,7 +2159,7 @@
               <w:rPr>
                 <w:sz w:val="18"/>
               </w:rPr>
-              <w:t>Стратегия тестирования</w:t>
+              <w:t>Концепция информационной безопасности</w:t>
             </w:r>
           </w:p>
         </w:tc>
@@ -2222,7 +2222,7 @@
               <w:rPr>
                 <w:sz w:val="18"/>
               </w:rPr>
-              <w:t>QA-лид</w:t>
+              <w:t>ИБ</w:t>
             </w:r>
           </w:p>
         </w:tc>
@@ -2245,7 +2245,7 @@
               <w:rPr>
                 <w:sz w:val="18"/>
               </w:rPr>
-              <w:t>13</w:t>
+              <w:t>12</w:t>
             </w:r>
           </w:p>
         </w:tc>
@@ -2266,7 +2266,7 @@
               <w:rPr>
                 <w:sz w:val="18"/>
               </w:rPr>
-              <w:t>ШК-06-02</w:t>
+              <w:t>ШК-06-01</w:t>
             </w:r>
           </w:p>
         </w:tc>
@@ -2287,7 +2287,7 @@
               <w:rPr>
                 <w:sz w:val="18"/>
               </w:rPr>
-              <w:t>Программа и методика испытаний</w:t>
+              <w:t>Стратегия тестирования</w:t>
             </w:r>
           </w:p>
         </w:tc>
@@ -2373,7 +2373,7 @@
               <w:rPr>
                 <w:sz w:val="18"/>
               </w:rPr>
-              <w:t>14</w:t>
+              <w:t>13</w:t>
             </w:r>
           </w:p>
         </w:tc>
@@ -2394,7 +2394,7 @@
               <w:rPr>
                 <w:sz w:val="18"/>
               </w:rPr>
-              <w:t>ШК-07-01</w:t>
+              <w:t>ШК-06-02</w:t>
             </w:r>
           </w:p>
         </w:tc>
@@ -2415,7 +2415,7 @@
               <w:rPr>
                 <w:sz w:val="18"/>
               </w:rPr>
-              <w:t>Развёртывание и эксплуатация</w:t>
+              <w:t>Программа и методика испытаний</w:t>
             </w:r>
           </w:p>
         </w:tc>
@@ -2478,7 +2478,7 @@
               <w:rPr>
                 <w:sz w:val="18"/>
               </w:rPr>
-              <w:t>DevOps</w:t>
+              <w:t>QA-лид</w:t>
             </w:r>
           </w:p>
         </w:tc>
@@ -2501,7 +2501,7 @@
               <w:rPr>
                 <w:sz w:val="18"/>
               </w:rPr>
-              <w:t>15</w:t>
+              <w:t>14</w:t>
             </w:r>
           </w:p>
         </w:tc>
@@ -2522,7 +2522,7 @@
               <w:rPr>
                 <w:sz w:val="18"/>
               </w:rPr>
-              <w:t>ШК-08-01</w:t>
+              <w:t>ШК-07-01</w:t>
             </w:r>
           </w:p>
         </w:tc>
@@ -2543,7 +2543,7 @@
               <w:rPr>
                 <w:sz w:val="18"/>
               </w:rPr>
-              <w:t>План разработки</w:t>
+              <w:t>Развёртывание и эксплуатация</w:t>
             </w:r>
           </w:p>
         </w:tc>
@@ -2606,7 +2606,7 @@
               <w:rPr>
                 <w:sz w:val="18"/>
               </w:rPr>
-              <w:t>РП</w:t>
+              <w:t>DevOps</w:t>
             </w:r>
           </w:p>
         </w:tc>
@@ -2629,7 +2629,7 @@
               <w:rPr>
                 <w:sz w:val="18"/>
               </w:rPr>
-              <w:t>16</w:t>
+              <w:t>15</w:t>
             </w:r>
           </w:p>
         </w:tc>
@@ -2650,7 +2650,7 @@
               <w:rPr>
                 <w:sz w:val="18"/>
               </w:rPr>
-              <w:t>ШК-08-02</w:t>
+              <w:t>ШК-08-01</w:t>
             </w:r>
           </w:p>
         </w:tc>
@@ -2671,7 +2671,7 @@
               <w:rPr>
                 <w:sz w:val="18"/>
               </w:rPr>
-              <w:t>Детальный план работ</w:t>
+              <w:t>План разработки</w:t>
             </w:r>
           </w:p>
         </w:tc>
@@ -2757,7 +2757,7 @@
               <w:rPr>
                 <w:sz w:val="18"/>
               </w:rPr>
-              <w:t>17</w:t>
+              <w:t>16</w:t>
             </w:r>
           </w:p>
         </w:tc>
@@ -2778,7 +2778,7 @@
               <w:rPr>
                 <w:sz w:val="18"/>
               </w:rPr>
-              <w:t>ШК-09-01</w:t>
+              <w:t>ШК-08-02</w:t>
             </w:r>
           </w:p>
         </w:tc>
@@ -2799,7 +2799,7 @@
               <w:rPr>
                 <w:sz w:val="18"/>
               </w:rPr>
-              <w:t>Реестр нормативных документов</w:t>
+              <w:t>Детальный план работ</w:t>
             </w:r>
           </w:p>
         </w:tc>
@@ -2862,7 +2862,7 @@
               <w:rPr>
                 <w:sz w:val="18"/>
               </w:rPr>
-              <w:t>Юрист / ИБ</w:t>
+              <w:t>РП</w:t>
             </w:r>
           </w:p>
         </w:tc>
@@ -2885,7 +2885,7 @@
               <w:rPr>
                 <w:sz w:val="18"/>
               </w:rPr>
-              <w:t>18</w:t>
+              <w:t>17</w:t>
             </w:r>
           </w:p>
         </w:tc>
@@ -2906,7 +2906,7 @@
               <w:rPr>
                 <w:sz w:val="18"/>
               </w:rPr>
-              <w:t>ШК-10-01</w:t>
+              <w:t>ШК-09-01</w:t>
             </w:r>
           </w:p>
         </w:tc>
@@ -2927,7 +2927,7 @@
               <w:rPr>
                 <w:sz w:val="18"/>
               </w:rPr>
-              <w:t>Шаблон отчёта о разработке</w:t>
+              <w:t>Реестр нормативных документов</w:t>
             </w:r>
           </w:p>
         </w:tc>
@@ -2990,7 +2990,7 @@
               <w:rPr>
                 <w:sz w:val="18"/>
               </w:rPr>
-              <w:t>РП</w:t>
+              <w:t>Юрист / ИБ</w:t>
             </w:r>
           </w:p>
         </w:tc>
@@ -3013,7 +3013,7 @@
               <w:rPr>
                 <w:sz w:val="18"/>
               </w:rPr>
-              <w:t>19</w:t>
+              <w:t>18</w:t>
             </w:r>
           </w:p>
         </w:tc>
@@ -3034,7 +3034,7 @@
               <w:rPr>
                 <w:sz w:val="18"/>
               </w:rPr>
-              <w:t>ШК-10-02</w:t>
+              <w:t>ШК-10-01</w:t>
             </w:r>
           </w:p>
         </w:tc>
@@ -3055,7 +3055,7 @@
               <w:rPr>
                 <w:sz w:val="18"/>
               </w:rPr>
-              <w:t>Шаблон отчёта о тестировании</w:t>
+              <w:t>Шаблон отчёта о разработке</w:t>
             </w:r>
           </w:p>
         </w:tc>
@@ -3118,7 +3118,7 @@
               <w:rPr>
                 <w:sz w:val="18"/>
               </w:rPr>
-              <w:t>QA-лид</w:t>
+              <w:t>РП</w:t>
             </w:r>
           </w:p>
         </w:tc>
@@ -3141,7 +3141,7 @@
               <w:rPr>
                 <w:sz w:val="18"/>
               </w:rPr>
-              <w:t>20</w:t>
+              <w:t>19</w:t>
             </w:r>
           </w:p>
         </w:tc>
@@ -3162,7 +3162,7 @@
               <w:rPr>
                 <w:sz w:val="18"/>
               </w:rPr>
-              <w:t>ШК-10-03</w:t>
+              <w:t>ШК-10-02</w:t>
             </w:r>
           </w:p>
         </w:tc>
@@ -3183,7 +3183,7 @@
               <w:rPr>
                 <w:sz w:val="18"/>
               </w:rPr>
-              <w:t>Журнал рисков</w:t>
+              <w:t>Шаблон отчёта о тестировании</w:t>
             </w:r>
           </w:p>
         </w:tc>
@@ -3246,7 +3246,7 @@
               <w:rPr>
                 <w:sz w:val="18"/>
               </w:rPr>
-              <w:t>РП</w:t>
+              <w:t>QA-лид</w:t>
             </w:r>
           </w:p>
         </w:tc>
@@ -3269,7 +3269,7 @@
               <w:rPr>
                 <w:sz w:val="18"/>
               </w:rPr>
-              <w:t>21</w:t>
+              <w:t>20</w:t>
             </w:r>
           </w:p>
         </w:tc>
@@ -3290,7 +3290,7 @@
               <w:rPr>
                 <w:sz w:val="18"/>
               </w:rPr>
-              <w:t>ШК-10-04</w:t>
+              <w:t>ШК-10-03</w:t>
             </w:r>
           </w:p>
         </w:tc>
@@ -3311,7 +3311,7 @@
               <w:rPr>
                 <w:sz w:val="18"/>
               </w:rPr>
-              <w:t>Журнал изменений</w:t>
+              <w:t>Журнал рисков</w:t>
             </w:r>
           </w:p>
         </w:tc>
@@ -3397,7 +3397,7 @@
               <w:rPr>
                 <w:sz w:val="18"/>
               </w:rPr>
-              <w:t>22</w:t>
+              <w:t>21</w:t>
             </w:r>
           </w:p>
         </w:tc>
@@ -3418,7 +3418,7 @@
               <w:rPr>
                 <w:sz w:val="18"/>
               </w:rPr>
-              <w:t>ШК-11-01</w:t>
+              <w:t>ШК-10-04</w:t>
             </w:r>
           </w:p>
         </w:tc>
@@ -3439,7 +3439,7 @@
               <w:rPr>
                 <w:sz w:val="18"/>
               </w:rPr>
-              <w:t>Правила OpenCode и промпты</w:t>
+              <w:t>Журнал изменений</w:t>
             </w:r>
           </w:p>
         </w:tc>
@@ -3502,7 +3502,7 @@
               <w:rPr>
                 <w:sz w:val="18"/>
               </w:rPr>
-              <w:t>Техлид</w:t>
+              <w:t>РП</w:t>
             </w:r>
           </w:p>
         </w:tc>
@@ -3525,7 +3525,7 @@
               <w:rPr>
                 <w:sz w:val="18"/>
               </w:rPr>
-              <w:t>23</w:t>
+              <w:t>22</w:t>
             </w:r>
           </w:p>
         </w:tc>
@@ -3546,7 +3546,7 @@
               <w:rPr>
                 <w:sz w:val="18"/>
               </w:rPr>
-              <w:t>ШК-10-05</w:t>
+              <w:t>ШК-11-01</w:t>
             </w:r>
           </w:p>
         </w:tc>
@@ -3567,7 +3567,7 @@
               <w:rPr>
                 <w:sz w:val="18"/>
               </w:rPr>
-              <w:t>Отчёт о завершении этапа 0</w:t>
+              <w:t>Правила OpenCode и промпты</w:t>
             </w:r>
           </w:p>
         </w:tc>
@@ -3610,6 +3610,262 @@
                 <w:sz w:val="18"/>
               </w:rPr>
               <w:t>Черновик</w:t>
+            </w:r>
+          </w:p>
+        </w:tc>
+        <w:tc>
+          <w:tcPr>
+            <w:tcW w:type="dxa" w:w="1662"/>
+          </w:tcPr>
+          <w:p>
+            <w:pPr>
+              <w:spacing w:after="20"/>
+            </w:pPr>
+            <w:r>
+              <w:rPr>
+                <w:sz w:val="18"/>
+              </w:rPr>
+            </w:r>
+            <w:r>
+              <w:rPr>
+                <w:sz w:val="18"/>
+              </w:rPr>
+              <w:t>Техлид</w:t>
+            </w:r>
+          </w:p>
+        </w:tc>
+      </w:tr>
+      <w:tr>
+        <w:tc>
+          <w:tcPr>
+            <w:tcW w:type="dxa" w:w="1662"/>
+          </w:tcPr>
+          <w:p>
+            <w:pPr>
+              <w:spacing w:after="20"/>
+            </w:pPr>
+            <w:r>
+              <w:rPr>
+                <w:sz w:val="18"/>
+              </w:rPr>
+            </w:r>
+            <w:r>
+              <w:rPr>
+                <w:sz w:val="18"/>
+              </w:rPr>
+              <w:t>23</w:t>
+            </w:r>
+          </w:p>
+        </w:tc>
+        <w:tc>
+          <w:tcPr>
+            <w:tcW w:type="dxa" w:w="1662"/>
+          </w:tcPr>
+          <w:p>
+            <w:pPr>
+              <w:spacing w:after="20"/>
+            </w:pPr>
+            <w:r>
+              <w:rPr>
+                <w:sz w:val="18"/>
+              </w:rPr>
+            </w:r>
+            <w:r>
+              <w:rPr>
+                <w:sz w:val="18"/>
+              </w:rPr>
+              <w:t>ШК-10-05</w:t>
+            </w:r>
+          </w:p>
+        </w:tc>
+        <w:tc>
+          <w:tcPr>
+            <w:tcW w:type="dxa" w:w="1662"/>
+          </w:tcPr>
+          <w:p>
+            <w:pPr>
+              <w:spacing w:after="20"/>
+            </w:pPr>
+            <w:r>
+              <w:rPr>
+                <w:sz w:val="18"/>
+              </w:rPr>
+            </w:r>
+            <w:r>
+              <w:rPr>
+                <w:sz w:val="18"/>
+              </w:rPr>
+              <w:t>Отчёт о завершении этапа 0</w:t>
+            </w:r>
+          </w:p>
+        </w:tc>
+        <w:tc>
+          <w:tcPr>
+            <w:tcW w:type="dxa" w:w="1662"/>
+          </w:tcPr>
+          <w:p>
+            <w:pPr>
+              <w:spacing w:after="20"/>
+            </w:pPr>
+            <w:r>
+              <w:rPr>
+                <w:sz w:val="18"/>
+              </w:rPr>
+            </w:r>
+            <w:r>
+              <w:rPr>
+                <w:sz w:val="18"/>
+              </w:rPr>
+              <w:t>0.1</w:t>
+            </w:r>
+          </w:p>
+        </w:tc>
+        <w:tc>
+          <w:tcPr>
+            <w:tcW w:type="dxa" w:w="1662"/>
+          </w:tcPr>
+          <w:p>
+            <w:pPr>
+              <w:spacing w:after="20"/>
+            </w:pPr>
+            <w:r>
+              <w:rPr>
+                <w:sz w:val="18"/>
+              </w:rPr>
+            </w:r>
+            <w:r>
+              <w:rPr>
+                <w:sz w:val="18"/>
+              </w:rPr>
+              <w:t>Рабочий</w:t>
+            </w:r>
+          </w:p>
+        </w:tc>
+        <w:tc>
+          <w:tcPr>
+            <w:tcW w:type="dxa" w:w="1662"/>
+          </w:tcPr>
+          <w:p>
+            <w:pPr>
+              <w:spacing w:after="20"/>
+            </w:pPr>
+            <w:r>
+              <w:rPr>
+                <w:sz w:val="18"/>
+              </w:rPr>
+            </w:r>
+            <w:r>
+              <w:rPr>
+                <w:sz w:val="18"/>
+              </w:rPr>
+              <w:t>РП</w:t>
+            </w:r>
+          </w:p>
+        </w:tc>
+      </w:tr>
+      <w:tr>
+        <w:tc>
+          <w:tcPr>
+            <w:tcW w:type="dxa" w:w="1662"/>
+          </w:tcPr>
+          <w:p>
+            <w:pPr>
+              <w:spacing w:after="20"/>
+            </w:pPr>
+            <w:r>
+              <w:rPr>
+                <w:sz w:val="18"/>
+              </w:rPr>
+            </w:r>
+            <w:r>
+              <w:rPr>
+                <w:sz w:val="18"/>
+              </w:rPr>
+              <w:t>24</w:t>
+            </w:r>
+          </w:p>
+        </w:tc>
+        <w:tc>
+          <w:tcPr>
+            <w:tcW w:type="dxa" w:w="1662"/>
+          </w:tcPr>
+          <w:p>
+            <w:pPr>
+              <w:spacing w:after="20"/>
+            </w:pPr>
+            <w:r>
+              <w:rPr>
+                <w:sz w:val="18"/>
+              </w:rPr>
+            </w:r>
+            <w:r>
+              <w:rPr>
+                <w:sz w:val="18"/>
+              </w:rPr>
+              <w:t>ШК-10-06</w:t>
+            </w:r>
+          </w:p>
+        </w:tc>
+        <w:tc>
+          <w:tcPr>
+            <w:tcW w:type="dxa" w:w="1662"/>
+          </w:tcPr>
+          <w:p>
+            <w:pPr>
+              <w:spacing w:after="20"/>
+            </w:pPr>
+            <w:r>
+              <w:rPr>
+                <w:sz w:val="18"/>
+              </w:rPr>
+            </w:r>
+            <w:r>
+              <w:rPr>
+                <w:sz w:val="18"/>
+              </w:rPr>
+              <w:t>Отчёт о завершении этапа 1</w:t>
+            </w:r>
+          </w:p>
+        </w:tc>
+        <w:tc>
+          <w:tcPr>
+            <w:tcW w:type="dxa" w:w="1662"/>
+          </w:tcPr>
+          <w:p>
+            <w:pPr>
+              <w:spacing w:after="20"/>
+            </w:pPr>
+            <w:r>
+              <w:rPr>
+                <w:sz w:val="18"/>
+              </w:rPr>
+            </w:r>
+            <w:r>
+              <w:rPr>
+                <w:sz w:val="18"/>
+              </w:rPr>
+              <w:t>0.1</w:t>
+            </w:r>
+          </w:p>
+        </w:tc>
+        <w:tc>
+          <w:tcPr>
+            <w:tcW w:type="dxa" w:w="1662"/>
+          </w:tcPr>
+          <w:p>
+            <w:pPr>
+              <w:spacing w:after="20"/>
+            </w:pPr>
+            <w:r>
+              <w:rPr>
+                <w:sz w:val="18"/>
+              </w:rPr>
+            </w:r>
+            <w:r>
+              <w:rPr>
+                <w:sz w:val="18"/>
+              </w:rPr>
+              <w:t>Рабочий</w:t>
             </w:r>
           </w:p>
         </w:tc>

</xml_diff>

<commit_message>
feat: add stage 2 domain models, legacy import and LMS content API
</commit_message>
<xml_diff>
--- a/docs/word/00-register/01-register-dokumentacii.docx
+++ b/docs/word/00-register/01-register-dokumentacii.docx
@@ -365,7 +365,7 @@
               <w:rPr>
                 <w:sz w:val="18"/>
               </w:rPr>
-              <w:t>0.2</w:t>
+              <w:t>0.3</w:t>
             </w:r>
           </w:p>
         </w:tc>
@@ -453,7 +453,7 @@
               <w:rPr>
                 <w:sz w:val="18"/>
               </w:rPr>
-              <w:t>27.10.2026</w:t>
+              <w:t>29.10.2026</w:t>
             </w:r>
           </w:p>
         </w:tc>
@@ -1540,7 +1540,7 @@
               <w:rPr>
                 <w:sz w:val="18"/>
               </w:rPr>
-              <w:t>0.2</w:t>
+              <w:t>0.3</w:t>
             </w:r>
           </w:p>
         </w:tc>
@@ -1924,7 +1924,7 @@
               <w:rPr>
                 <w:sz w:val="18"/>
               </w:rPr>
-              <w:t>0.1</w:t>
+              <w:t>0.2</w:t>
             </w:r>
           </w:p>
         </w:tc>
@@ -2436,7 +2436,7 @@
               <w:rPr>
                 <w:sz w:val="18"/>
               </w:rPr>
-              <w:t>0.1</w:t>
+              <w:t>0.2</w:t>
             </w:r>
           </w:p>
         </w:tc>
@@ -3460,7 +3460,7 @@
               <w:rPr>
                 <w:sz w:val="18"/>
               </w:rPr>
-              <w:t>0.1</w:t>
+              <w:t>0.2</w:t>
             </w:r>
           </w:p>
         </w:tc>
@@ -3481,7 +3481,7 @@
               <w:rPr>
                 <w:sz w:val="18"/>
               </w:rPr>
-              <w:t>Черновик</w:t>
+              <w:t>Рабочий</w:t>
             </w:r>
           </w:p>
         </w:tc>
@@ -3887,6 +3887,134 @@
                 <w:sz w:val="18"/>
               </w:rPr>
               <w:t>РП</w:t>
+            </w:r>
+          </w:p>
+        </w:tc>
+      </w:tr>
+      <w:tr>
+        <w:tc>
+          <w:tcPr>
+            <w:tcW w:type="dxa" w:w="1662"/>
+          </w:tcPr>
+          <w:p>
+            <w:pPr>
+              <w:spacing w:after="20"/>
+            </w:pPr>
+            <w:r>
+              <w:rPr>
+                <w:sz w:val="18"/>
+              </w:rPr>
+            </w:r>
+            <w:r>
+              <w:rPr>
+                <w:sz w:val="18"/>
+              </w:rPr>
+              <w:t>25</w:t>
+            </w:r>
+          </w:p>
+        </w:tc>
+        <w:tc>
+          <w:tcPr>
+            <w:tcW w:type="dxa" w:w="1662"/>
+          </w:tcPr>
+          <w:p>
+            <w:pPr>
+              <w:spacing w:after="20"/>
+            </w:pPr>
+            <w:r>
+              <w:rPr>
+                <w:sz w:val="18"/>
+              </w:rPr>
+            </w:r>
+            <w:r>
+              <w:rPr>
+                <w:sz w:val="18"/>
+              </w:rPr>
+              <w:t>ШК-10-07</w:t>
+            </w:r>
+          </w:p>
+        </w:tc>
+        <w:tc>
+          <w:tcPr>
+            <w:tcW w:type="dxa" w:w="1662"/>
+          </w:tcPr>
+          <w:p>
+            <w:pPr>
+              <w:spacing w:after="20"/>
+            </w:pPr>
+            <w:r>
+              <w:rPr>
+                <w:sz w:val="18"/>
+              </w:rPr>
+            </w:r>
+            <w:r>
+              <w:rPr>
+                <w:sz w:val="18"/>
+              </w:rPr>
+              <w:t>Отчёт о тестировании API LMS</w:t>
+            </w:r>
+          </w:p>
+        </w:tc>
+        <w:tc>
+          <w:tcPr>
+            <w:tcW w:type="dxa" w:w="1662"/>
+          </w:tcPr>
+          <w:p>
+            <w:pPr>
+              <w:spacing w:after="20"/>
+            </w:pPr>
+            <w:r>
+              <w:rPr>
+                <w:sz w:val="18"/>
+              </w:rPr>
+            </w:r>
+            <w:r>
+              <w:rPr>
+                <w:sz w:val="18"/>
+              </w:rPr>
+              <w:t>0.1</w:t>
+            </w:r>
+          </w:p>
+        </w:tc>
+        <w:tc>
+          <w:tcPr>
+            <w:tcW w:type="dxa" w:w="1662"/>
+          </w:tcPr>
+          <w:p>
+            <w:pPr>
+              <w:spacing w:after="20"/>
+            </w:pPr>
+            <w:r>
+              <w:rPr>
+                <w:sz w:val="18"/>
+              </w:rPr>
+            </w:r>
+            <w:r>
+              <w:rPr>
+                <w:sz w:val="18"/>
+              </w:rPr>
+              <w:t>Рабочий</w:t>
+            </w:r>
+          </w:p>
+        </w:tc>
+        <w:tc>
+          <w:tcPr>
+            <w:tcW w:type="dxa" w:w="1662"/>
+          </w:tcPr>
+          <w:p>
+            <w:pPr>
+              <w:spacing w:after="20"/>
+            </w:pPr>
+            <w:r>
+              <w:rPr>
+                <w:sz w:val="18"/>
+              </w:rPr>
+            </w:r>
+            <w:r>
+              <w:rPr>
+                <w:sz w:val="18"/>
+              </w:rPr>
+              <w:t>QA-лид</w:t>
             </w:r>
           </w:p>
         </w:tc>

</xml_diff>

<commit_message>
feat(assessment): add quizzes, assignments, submissions and auto-grading API
</commit_message>
<xml_diff>
--- a/docs/word/00-register/01-register-dokumentacii.docx
+++ b/docs/word/00-register/01-register-dokumentacii.docx
@@ -365,7 +365,7 @@
               <w:rPr>
                 <w:sz w:val="18"/>
               </w:rPr>
-              <w:t>0.3</w:t>
+              <w:t>0.4</w:t>
             </w:r>
           </w:p>
         </w:tc>
@@ -1540,7 +1540,7 @@
               <w:rPr>
                 <w:sz w:val="18"/>
               </w:rPr>
-              <w:t>0.3</w:t>
+              <w:t>0.4</w:t>
             </w:r>
           </w:p>
         </w:tc>
@@ -1924,7 +1924,7 @@
               <w:rPr>
                 <w:sz w:val="18"/>
               </w:rPr>
-              <w:t>0.2</w:t>
+              <w:t>0.3</w:t>
             </w:r>
           </w:p>
         </w:tc>
@@ -2436,7 +2436,7 @@
               <w:rPr>
                 <w:sz w:val="18"/>
               </w:rPr>
-              <w:t>0.2</w:t>
+              <w:t>0.3</w:t>
             </w:r>
           </w:p>
         </w:tc>
@@ -3460,7 +3460,7 @@
               <w:rPr>
                 <w:sz w:val="18"/>
               </w:rPr>
-              <w:t>0.2</w:t>
+              <w:t>0.3</w:t>
             </w:r>
           </w:p>
         </w:tc>
@@ -3952,6 +3952,134 @@
                 <w:sz w:val="18"/>
               </w:rPr>
               <w:t>Отчёт о тестировании API LMS</w:t>
+            </w:r>
+          </w:p>
+        </w:tc>
+        <w:tc>
+          <w:tcPr>
+            <w:tcW w:type="dxa" w:w="1662"/>
+          </w:tcPr>
+          <w:p>
+            <w:pPr>
+              <w:spacing w:after="20"/>
+            </w:pPr>
+            <w:r>
+              <w:rPr>
+                <w:sz w:val="18"/>
+              </w:rPr>
+            </w:r>
+            <w:r>
+              <w:rPr>
+                <w:sz w:val="18"/>
+              </w:rPr>
+              <w:t>0.1</w:t>
+            </w:r>
+          </w:p>
+        </w:tc>
+        <w:tc>
+          <w:tcPr>
+            <w:tcW w:type="dxa" w:w="1662"/>
+          </w:tcPr>
+          <w:p>
+            <w:pPr>
+              <w:spacing w:after="20"/>
+            </w:pPr>
+            <w:r>
+              <w:rPr>
+                <w:sz w:val="18"/>
+              </w:rPr>
+            </w:r>
+            <w:r>
+              <w:rPr>
+                <w:sz w:val="18"/>
+              </w:rPr>
+              <w:t>Рабочий</w:t>
+            </w:r>
+          </w:p>
+        </w:tc>
+        <w:tc>
+          <w:tcPr>
+            <w:tcW w:type="dxa" w:w="1662"/>
+          </w:tcPr>
+          <w:p>
+            <w:pPr>
+              <w:spacing w:after="20"/>
+            </w:pPr>
+            <w:r>
+              <w:rPr>
+                <w:sz w:val="18"/>
+              </w:rPr>
+            </w:r>
+            <w:r>
+              <w:rPr>
+                <w:sz w:val="18"/>
+              </w:rPr>
+              <w:t>QA-лид</w:t>
+            </w:r>
+          </w:p>
+        </w:tc>
+      </w:tr>
+      <w:tr>
+        <w:tc>
+          <w:tcPr>
+            <w:tcW w:type="dxa" w:w="1662"/>
+          </w:tcPr>
+          <w:p>
+            <w:pPr>
+              <w:spacing w:after="20"/>
+            </w:pPr>
+            <w:r>
+              <w:rPr>
+                <w:sz w:val="18"/>
+              </w:rPr>
+            </w:r>
+            <w:r>
+              <w:rPr>
+                <w:sz w:val="18"/>
+              </w:rPr>
+              <w:t>26</w:t>
+            </w:r>
+          </w:p>
+        </w:tc>
+        <w:tc>
+          <w:tcPr>
+            <w:tcW w:type="dxa" w:w="1662"/>
+          </w:tcPr>
+          <w:p>
+            <w:pPr>
+              <w:spacing w:after="20"/>
+            </w:pPr>
+            <w:r>
+              <w:rPr>
+                <w:sz w:val="18"/>
+              </w:rPr>
+            </w:r>
+            <w:r>
+              <w:rPr>
+                <w:sz w:val="18"/>
+              </w:rPr>
+              <w:t>ШК-10-08</w:t>
+            </w:r>
+          </w:p>
+        </w:tc>
+        <w:tc>
+          <w:tcPr>
+            <w:tcW w:type="dxa" w:w="1662"/>
+          </w:tcPr>
+          <w:p>
+            <w:pPr>
+              <w:spacing w:after="20"/>
+            </w:pPr>
+            <w:r>
+              <w:rPr>
+                <w:sz w:val="18"/>
+              </w:rPr>
+            </w:r>
+            <w:r>
+              <w:rPr>
+                <w:sz w:val="18"/>
+              </w:rPr>
+              <w:t>Отчёт о тестировании API assessment</w:t>
             </w:r>
           </w:p>
         </w:tc>

</xml_diff>

<commit_message>
feat(journal): add schedule, grades, attendance and summary API
</commit_message>
<xml_diff>
--- a/docs/word/00-register/01-register-dokumentacii.docx
+++ b/docs/word/00-register/01-register-dokumentacii.docx
@@ -365,7 +365,7 @@
               <w:rPr>
                 <w:sz w:val="18"/>
               </w:rPr>
-              <w:t>0.4</w:t>
+              <w:t>0.5</w:t>
             </w:r>
           </w:p>
         </w:tc>
@@ -1540,7 +1540,7 @@
               <w:rPr>
                 <w:sz w:val="18"/>
               </w:rPr>
-              <w:t>0.4</w:t>
+              <w:t>0.5</w:t>
             </w:r>
           </w:p>
         </w:tc>
@@ -1924,7 +1924,7 @@
               <w:rPr>
                 <w:sz w:val="18"/>
               </w:rPr>
-              <w:t>0.3</w:t>
+              <w:t>0.4</w:t>
             </w:r>
           </w:p>
         </w:tc>
@@ -2436,7 +2436,7 @@
               <w:rPr>
                 <w:sz w:val="18"/>
               </w:rPr>
-              <w:t>0.3</w:t>
+              <w:t>0.4</w:t>
             </w:r>
           </w:p>
         </w:tc>
@@ -3460,7 +3460,7 @@
               <w:rPr>
                 <w:sz w:val="18"/>
               </w:rPr>
-              <w:t>0.3</w:t>
+              <w:t>0.4</w:t>
             </w:r>
           </w:p>
         </w:tc>
@@ -4080,6 +4080,134 @@
                 <w:sz w:val="18"/>
               </w:rPr>
               <w:t>Отчёт о тестировании API assessment</w:t>
+            </w:r>
+          </w:p>
+        </w:tc>
+        <w:tc>
+          <w:tcPr>
+            <w:tcW w:type="dxa" w:w="1662"/>
+          </w:tcPr>
+          <w:p>
+            <w:pPr>
+              <w:spacing w:after="20"/>
+            </w:pPr>
+            <w:r>
+              <w:rPr>
+                <w:sz w:val="18"/>
+              </w:rPr>
+            </w:r>
+            <w:r>
+              <w:rPr>
+                <w:sz w:val="18"/>
+              </w:rPr>
+              <w:t>0.1</w:t>
+            </w:r>
+          </w:p>
+        </w:tc>
+        <w:tc>
+          <w:tcPr>
+            <w:tcW w:type="dxa" w:w="1662"/>
+          </w:tcPr>
+          <w:p>
+            <w:pPr>
+              <w:spacing w:after="20"/>
+            </w:pPr>
+            <w:r>
+              <w:rPr>
+                <w:sz w:val="18"/>
+              </w:rPr>
+            </w:r>
+            <w:r>
+              <w:rPr>
+                <w:sz w:val="18"/>
+              </w:rPr>
+              <w:t>Рабочий</w:t>
+            </w:r>
+          </w:p>
+        </w:tc>
+        <w:tc>
+          <w:tcPr>
+            <w:tcW w:type="dxa" w:w="1662"/>
+          </w:tcPr>
+          <w:p>
+            <w:pPr>
+              <w:spacing w:after="20"/>
+            </w:pPr>
+            <w:r>
+              <w:rPr>
+                <w:sz w:val="18"/>
+              </w:rPr>
+            </w:r>
+            <w:r>
+              <w:rPr>
+                <w:sz w:val="18"/>
+              </w:rPr>
+              <w:t>QA-лид</w:t>
+            </w:r>
+          </w:p>
+        </w:tc>
+      </w:tr>
+      <w:tr>
+        <w:tc>
+          <w:tcPr>
+            <w:tcW w:type="dxa" w:w="1662"/>
+          </w:tcPr>
+          <w:p>
+            <w:pPr>
+              <w:spacing w:after="20"/>
+            </w:pPr>
+            <w:r>
+              <w:rPr>
+                <w:sz w:val="18"/>
+              </w:rPr>
+            </w:r>
+            <w:r>
+              <w:rPr>
+                <w:sz w:val="18"/>
+              </w:rPr>
+              <w:t>27</w:t>
+            </w:r>
+          </w:p>
+        </w:tc>
+        <w:tc>
+          <w:tcPr>
+            <w:tcW w:type="dxa" w:w="1662"/>
+          </w:tcPr>
+          <w:p>
+            <w:pPr>
+              <w:spacing w:after="20"/>
+            </w:pPr>
+            <w:r>
+              <w:rPr>
+                <w:sz w:val="18"/>
+              </w:rPr>
+            </w:r>
+            <w:r>
+              <w:rPr>
+                <w:sz w:val="18"/>
+              </w:rPr>
+              <w:t>ШК-10-09</w:t>
+            </w:r>
+          </w:p>
+        </w:tc>
+        <w:tc>
+          <w:tcPr>
+            <w:tcW w:type="dxa" w:w="1662"/>
+          </w:tcPr>
+          <w:p>
+            <w:pPr>
+              <w:spacing w:after="20"/>
+            </w:pPr>
+            <w:r>
+              <w:rPr>
+                <w:sz w:val="18"/>
+              </w:rPr>
+            </w:r>
+            <w:r>
+              <w:rPr>
+                <w:sz w:val="18"/>
+              </w:rPr>
+              <w:t>Отчёт о тестировании API journal</w:t>
             </w:r>
           </w:p>
         </w:tc>

</xml_diff>

<commit_message>
docs: refresh 0.6 package with microservices and group RBAC
</commit_message>
<xml_diff>
--- a/docs/word/00-register/01-register-dokumentacii.docx
+++ b/docs/word/00-register/01-register-dokumentacii.docx
@@ -63,7 +63,7 @@
           </w:tcPr>
           <w:p>
             <w:r>
-              <w:t>0.1</w:t>
+              <w:t>0.6</w:t>
             </w:r>
           </w:p>
         </w:tc>
@@ -115,7 +115,7 @@
           </w:tcPr>
           <w:p>
             <w:r>
-              <w:t>27.10.2026</w:t>
+              <w:t>30.10.2026</w:t>
             </w:r>
           </w:p>
         </w:tc>
@@ -365,7 +365,7 @@
               <w:rPr>
                 <w:sz w:val="18"/>
               </w:rPr>
-              <w:t>0.5</w:t>
+              <w:t>0.6</w:t>
             </w:r>
           </w:p>
         </w:tc>
@@ -453,7 +453,7 @@
               <w:rPr>
                 <w:sz w:val="18"/>
               </w:rPr>
-              <w:t>29.10.2026</w:t>
+              <w:t>30.10.2026</w:t>
             </w:r>
           </w:p>
         </w:tc>
@@ -1028,7 +1028,7 @@
               <w:rPr>
                 <w:sz w:val="18"/>
               </w:rPr>
-              <w:t>0.1</w:t>
+              <w:t>0.2</w:t>
             </w:r>
           </w:p>
         </w:tc>
@@ -1156,7 +1156,7 @@
               <w:rPr>
                 <w:sz w:val="18"/>
               </w:rPr>
-              <w:t>0.1</w:t>
+              <w:t>0.2</w:t>
             </w:r>
           </w:p>
         </w:tc>
@@ -1412,7 +1412,7 @@
               <w:rPr>
                 <w:sz w:val="18"/>
               </w:rPr>
-              <w:t>0.1</w:t>
+              <w:t>0.2</w:t>
             </w:r>
           </w:p>
         </w:tc>
@@ -1433,7 +1433,7 @@
               <w:rPr>
                 <w:sz w:val="18"/>
               </w:rPr>
-              <w:t>Черновик</w:t>
+              <w:t>Рабочий</w:t>
             </w:r>
           </w:p>
         </w:tc>
@@ -1668,7 +1668,7 @@
               <w:rPr>
                 <w:sz w:val="18"/>
               </w:rPr>
-              <w:t>0.1</w:t>
+              <w:t>0.2</w:t>
             </w:r>
           </w:p>
         </w:tc>
@@ -1689,7 +1689,7 @@
               <w:rPr>
                 <w:sz w:val="18"/>
               </w:rPr>
-              <w:t>Черновик</w:t>
+              <w:t>Рабочий</w:t>
             </w:r>
           </w:p>
         </w:tc>
@@ -1989,7 +1989,7 @@
               <w:rPr>
                 <w:sz w:val="18"/>
               </w:rPr>
-              <w:t>10</w:t>
+              <w:t>9.2</w:t>
             </w:r>
           </w:p>
         </w:tc>
@@ -2010,7 +2010,7 @@
               <w:rPr>
                 <w:sz w:val="18"/>
               </w:rPr>
-              <w:t>ШК-04-01</w:t>
+              <w:t>ШК-03-04</w:t>
             </w:r>
           </w:p>
         </w:tc>
@@ -2031,7 +2031,7 @@
               <w:rPr>
                 <w:sz w:val="18"/>
               </w:rPr>
-              <w:t>Модель данных</w:t>
+              <w:t>Микросервисная архитектура</w:t>
             </w:r>
           </w:p>
         </w:tc>
@@ -2052,7 +2052,7 @@
               <w:rPr>
                 <w:sz w:val="18"/>
               </w:rPr>
-              <w:t>0.1</w:t>
+              <w:t>1.0</w:t>
             </w:r>
           </w:p>
         </w:tc>
@@ -2073,7 +2073,7 @@
               <w:rPr>
                 <w:sz w:val="18"/>
               </w:rPr>
-              <w:t>Черновик</w:t>
+              <w:t>Рабочий</w:t>
             </w:r>
           </w:p>
         </w:tc>
@@ -2094,7 +2094,7 @@
               <w:rPr>
                 <w:sz w:val="18"/>
               </w:rPr>
-              <w:t>Архитектор БД</w:t>
+              <w:t>Архитектор</w:t>
             </w:r>
           </w:p>
         </w:tc>
@@ -2117,7 +2117,7 @@
               <w:rPr>
                 <w:sz w:val="18"/>
               </w:rPr>
-              <w:t>11</w:t>
+              <w:t>9.3</w:t>
             </w:r>
           </w:p>
         </w:tc>
@@ -2138,7 +2138,7 @@
               <w:rPr>
                 <w:sz w:val="18"/>
               </w:rPr>
-              <w:t>ШК-05-01</w:t>
+              <w:t>ШК-03-05</w:t>
             </w:r>
           </w:p>
         </w:tc>
@@ -2159,7 +2159,7 @@
               <w:rPr>
                 <w:sz w:val="18"/>
               </w:rPr>
-              <w:t>Концепция информационной безопасности</w:t>
+              <w:t>Группы пользователей и права</w:t>
             </w:r>
           </w:p>
         </w:tc>
@@ -2180,7 +2180,7 @@
               <w:rPr>
                 <w:sz w:val="18"/>
               </w:rPr>
-              <w:t>0.1</w:t>
+              <w:t>1.0</w:t>
             </w:r>
           </w:p>
         </w:tc>
@@ -2201,7 +2201,7 @@
               <w:rPr>
                 <w:sz w:val="18"/>
               </w:rPr>
-              <w:t>Черновик</w:t>
+              <w:t>Рабочий</w:t>
             </w:r>
           </w:p>
         </w:tc>
@@ -2222,7 +2222,7 @@
               <w:rPr>
                 <w:sz w:val="18"/>
               </w:rPr>
-              <w:t>ИБ</w:t>
+              <w:t>Архитектор / ИБ</w:t>
             </w:r>
           </w:p>
         </w:tc>
@@ -2245,7 +2245,7 @@
               <w:rPr>
                 <w:sz w:val="18"/>
               </w:rPr>
-              <w:t>12</w:t>
+              <w:t>10</w:t>
             </w:r>
           </w:p>
         </w:tc>
@@ -2266,7 +2266,7 @@
               <w:rPr>
                 <w:sz w:val="18"/>
               </w:rPr>
-              <w:t>ШК-06-01</w:t>
+              <w:t>ШК-04-01</w:t>
             </w:r>
           </w:p>
         </w:tc>
@@ -2287,7 +2287,7 @@
               <w:rPr>
                 <w:sz w:val="18"/>
               </w:rPr>
-              <w:t>Стратегия тестирования</w:t>
+              <w:t>Модель данных</w:t>
             </w:r>
           </w:p>
         </w:tc>
@@ -2308,7 +2308,7 @@
               <w:rPr>
                 <w:sz w:val="18"/>
               </w:rPr>
-              <w:t>0.1</w:t>
+              <w:t>0.2</w:t>
             </w:r>
           </w:p>
         </w:tc>
@@ -2329,7 +2329,7 @@
               <w:rPr>
                 <w:sz w:val="18"/>
               </w:rPr>
-              <w:t>Черновик</w:t>
+              <w:t>Рабочий</w:t>
             </w:r>
           </w:p>
         </w:tc>
@@ -2350,7 +2350,7 @@
               <w:rPr>
                 <w:sz w:val="18"/>
               </w:rPr>
-              <w:t>QA-лид</w:t>
+              <w:t>Архитектор БД</w:t>
             </w:r>
           </w:p>
         </w:tc>
@@ -2373,7 +2373,7 @@
               <w:rPr>
                 <w:sz w:val="18"/>
               </w:rPr>
-              <w:t>13</w:t>
+              <w:t>10.1</w:t>
             </w:r>
           </w:p>
         </w:tc>
@@ -2394,7 +2394,7 @@
               <w:rPr>
                 <w:sz w:val="18"/>
               </w:rPr>
-              <w:t>ШК-06-02</w:t>
+              <w:t>ШК-04-02</w:t>
             </w:r>
           </w:p>
         </w:tc>
@@ -2415,7 +2415,7 @@
               <w:rPr>
                 <w:sz w:val="18"/>
               </w:rPr>
-              <w:t>Программа и методика испытаний</w:t>
+              <w:t>Модель групп, прав и сервисов</w:t>
             </w:r>
           </w:p>
         </w:tc>
@@ -2436,7 +2436,7 @@
               <w:rPr>
                 <w:sz w:val="18"/>
               </w:rPr>
-              <w:t>0.4</w:t>
+              <w:t>1.0</w:t>
             </w:r>
           </w:p>
         </w:tc>
@@ -2457,7 +2457,7 @@
               <w:rPr>
                 <w:sz w:val="18"/>
               </w:rPr>
-              <w:t>Черновик</w:t>
+              <w:t>Рабочий</w:t>
             </w:r>
           </w:p>
         </w:tc>
@@ -2478,7 +2478,7 @@
               <w:rPr>
                 <w:sz w:val="18"/>
               </w:rPr>
-              <w:t>QA-лид</w:t>
+              <w:t>Архитектор БД</w:t>
             </w:r>
           </w:p>
         </w:tc>
@@ -2501,7 +2501,7 @@
               <w:rPr>
                 <w:sz w:val="18"/>
               </w:rPr>
-              <w:t>14</w:t>
+              <w:t>11</w:t>
             </w:r>
           </w:p>
         </w:tc>
@@ -2522,7 +2522,7 @@
               <w:rPr>
                 <w:sz w:val="18"/>
               </w:rPr>
-              <w:t>ШК-07-01</w:t>
+              <w:t>ШК-05-01</w:t>
             </w:r>
           </w:p>
         </w:tc>
@@ -2543,7 +2543,7 @@
               <w:rPr>
                 <w:sz w:val="18"/>
               </w:rPr>
-              <w:t>Развёртывание и эксплуатация</w:t>
+              <w:t>Концепция информационной безопасности</w:t>
             </w:r>
           </w:p>
         </w:tc>
@@ -2606,7 +2606,7 @@
               <w:rPr>
                 <w:sz w:val="18"/>
               </w:rPr>
-              <w:t>DevOps</w:t>
+              <w:t>ИБ</w:t>
             </w:r>
           </w:p>
         </w:tc>
@@ -2629,7 +2629,7 @@
               <w:rPr>
                 <w:sz w:val="18"/>
               </w:rPr>
-              <w:t>15</w:t>
+              <w:t>12</w:t>
             </w:r>
           </w:p>
         </w:tc>
@@ -2650,7 +2650,7 @@
               <w:rPr>
                 <w:sz w:val="18"/>
               </w:rPr>
-              <w:t>ШК-08-01</w:t>
+              <w:t>ШК-06-01</w:t>
             </w:r>
           </w:p>
         </w:tc>
@@ -2671,7 +2671,7 @@
               <w:rPr>
                 <w:sz w:val="18"/>
               </w:rPr>
-              <w:t>План разработки</w:t>
+              <w:t>Стратегия тестирования</w:t>
             </w:r>
           </w:p>
         </w:tc>
@@ -2734,7 +2734,7 @@
               <w:rPr>
                 <w:sz w:val="18"/>
               </w:rPr>
-              <w:t>РП</w:t>
+              <w:t>QA-лид</w:t>
             </w:r>
           </w:p>
         </w:tc>
@@ -2757,7 +2757,7 @@
               <w:rPr>
                 <w:sz w:val="18"/>
               </w:rPr>
-              <w:t>16</w:t>
+              <w:t>13</w:t>
             </w:r>
           </w:p>
         </w:tc>
@@ -2778,7 +2778,7 @@
               <w:rPr>
                 <w:sz w:val="18"/>
               </w:rPr>
-              <w:t>ШК-08-02</w:t>
+              <w:t>ШК-06-02</w:t>
             </w:r>
           </w:p>
         </w:tc>
@@ -2799,7 +2799,7 @@
               <w:rPr>
                 <w:sz w:val="18"/>
               </w:rPr>
-              <w:t>Детальный план работ</w:t>
+              <w:t>Программа и методика испытаний</w:t>
             </w:r>
           </w:p>
         </w:tc>
@@ -2820,7 +2820,7 @@
               <w:rPr>
                 <w:sz w:val="18"/>
               </w:rPr>
-              <w:t>0.1</w:t>
+              <w:t>0.4</w:t>
             </w:r>
           </w:p>
         </w:tc>
@@ -2862,7 +2862,7 @@
               <w:rPr>
                 <w:sz w:val="18"/>
               </w:rPr>
-              <w:t>РП</w:t>
+              <w:t>QA-лид</w:t>
             </w:r>
           </w:p>
         </w:tc>
@@ -2885,7 +2885,7 @@
               <w:rPr>
                 <w:sz w:val="18"/>
               </w:rPr>
-              <w:t>17</w:t>
+              <w:t>14</w:t>
             </w:r>
           </w:p>
         </w:tc>
@@ -2906,7 +2906,7 @@
               <w:rPr>
                 <w:sz w:val="18"/>
               </w:rPr>
-              <w:t>ШК-09-01</w:t>
+              <w:t>ШК-07-01</w:t>
             </w:r>
           </w:p>
         </w:tc>
@@ -2927,7 +2927,7 @@
               <w:rPr>
                 <w:sz w:val="18"/>
               </w:rPr>
-              <w:t>Реестр нормативных документов</w:t>
+              <w:t>Развёртывание и эксплуатация</w:t>
             </w:r>
           </w:p>
         </w:tc>
@@ -2990,7 +2990,7 @@
               <w:rPr>
                 <w:sz w:val="18"/>
               </w:rPr>
-              <w:t>Юрист / ИБ</w:t>
+              <w:t>DevOps</w:t>
             </w:r>
           </w:p>
         </w:tc>
@@ -3013,7 +3013,7 @@
               <w:rPr>
                 <w:sz w:val="18"/>
               </w:rPr>
-              <w:t>18</w:t>
+              <w:t>15</w:t>
             </w:r>
           </w:p>
         </w:tc>
@@ -3034,7 +3034,7 @@
               <w:rPr>
                 <w:sz w:val="18"/>
               </w:rPr>
-              <w:t>ШК-10-01</w:t>
+              <w:t>ШК-08-01</w:t>
             </w:r>
           </w:p>
         </w:tc>
@@ -3055,7 +3055,7 @@
               <w:rPr>
                 <w:sz w:val="18"/>
               </w:rPr>
-              <w:t>Шаблон отчёта о разработке</w:t>
+              <w:t>План разработки</w:t>
             </w:r>
           </w:p>
         </w:tc>
@@ -3076,7 +3076,7 @@
               <w:rPr>
                 <w:sz w:val="18"/>
               </w:rPr>
-              <w:t>0.1</w:t>
+              <w:t>0.2</w:t>
             </w:r>
           </w:p>
         </w:tc>
@@ -3097,7 +3097,7 @@
               <w:rPr>
                 <w:sz w:val="18"/>
               </w:rPr>
-              <w:t>Черновик</w:t>
+              <w:t>Рабочий</w:t>
             </w:r>
           </w:p>
         </w:tc>
@@ -3141,7 +3141,7 @@
               <w:rPr>
                 <w:sz w:val="18"/>
               </w:rPr>
-              <w:t>19</w:t>
+              <w:t>16</w:t>
             </w:r>
           </w:p>
         </w:tc>
@@ -3162,7 +3162,7 @@
               <w:rPr>
                 <w:sz w:val="18"/>
               </w:rPr>
-              <w:t>ШК-10-02</w:t>
+              <w:t>ШК-08-02</w:t>
             </w:r>
           </w:p>
         </w:tc>
@@ -3183,7 +3183,7 @@
               <w:rPr>
                 <w:sz w:val="18"/>
               </w:rPr>
-              <w:t>Шаблон отчёта о тестировании</w:t>
+              <w:t>Детальный план работ</w:t>
             </w:r>
           </w:p>
         </w:tc>
@@ -3246,7 +3246,7 @@
               <w:rPr>
                 <w:sz w:val="18"/>
               </w:rPr>
-              <w:t>QA-лид</w:t>
+              <w:t>РП</w:t>
             </w:r>
           </w:p>
         </w:tc>
@@ -3269,7 +3269,7 @@
               <w:rPr>
                 <w:sz w:val="18"/>
               </w:rPr>
-              <w:t>20</w:t>
+              <w:t>17</w:t>
             </w:r>
           </w:p>
         </w:tc>
@@ -3290,7 +3290,7 @@
               <w:rPr>
                 <w:sz w:val="18"/>
               </w:rPr>
-              <w:t>ШК-10-03</w:t>
+              <w:t>ШК-09-01</w:t>
             </w:r>
           </w:p>
         </w:tc>
@@ -3311,7 +3311,7 @@
               <w:rPr>
                 <w:sz w:val="18"/>
               </w:rPr>
-              <w:t>Журнал рисков</w:t>
+              <w:t>Реестр нормативных документов</w:t>
             </w:r>
           </w:p>
         </w:tc>
@@ -3374,7 +3374,7 @@
               <w:rPr>
                 <w:sz w:val="18"/>
               </w:rPr>
-              <w:t>РП</w:t>
+              <w:t>Юрист / ИБ</w:t>
             </w:r>
           </w:p>
         </w:tc>
@@ -3397,7 +3397,7 @@
               <w:rPr>
                 <w:sz w:val="18"/>
               </w:rPr>
-              <w:t>21</w:t>
+              <w:t>18</w:t>
             </w:r>
           </w:p>
         </w:tc>
@@ -3418,7 +3418,7 @@
               <w:rPr>
                 <w:sz w:val="18"/>
               </w:rPr>
-              <w:t>ШК-10-04</w:t>
+              <w:t>ШК-10-01</w:t>
             </w:r>
           </w:p>
         </w:tc>
@@ -3439,7 +3439,7 @@
               <w:rPr>
                 <w:sz w:val="18"/>
               </w:rPr>
-              <w:t>Журнал изменений</w:t>
+              <w:t>Шаблон отчёта о разработке</w:t>
             </w:r>
           </w:p>
         </w:tc>
@@ -3460,7 +3460,7 @@
               <w:rPr>
                 <w:sz w:val="18"/>
               </w:rPr>
-              <w:t>0.4</w:t>
+              <w:t>0.1</w:t>
             </w:r>
           </w:p>
         </w:tc>
@@ -3481,7 +3481,7 @@
               <w:rPr>
                 <w:sz w:val="18"/>
               </w:rPr>
-              <w:t>Рабочий</w:t>
+              <w:t>Черновик</w:t>
             </w:r>
           </w:p>
         </w:tc>
@@ -3525,7 +3525,7 @@
               <w:rPr>
                 <w:sz w:val="18"/>
               </w:rPr>
-              <w:t>22</w:t>
+              <w:t>19</w:t>
             </w:r>
           </w:p>
         </w:tc>
@@ -3546,7 +3546,7 @@
               <w:rPr>
                 <w:sz w:val="18"/>
               </w:rPr>
-              <w:t>ШК-11-01</w:t>
+              <w:t>ШК-10-02</w:t>
             </w:r>
           </w:p>
         </w:tc>
@@ -3567,7 +3567,7 @@
               <w:rPr>
                 <w:sz w:val="18"/>
               </w:rPr>
-              <w:t>Правила OpenCode и промпты</w:t>
+              <w:t>Шаблон отчёта о тестировании</w:t>
             </w:r>
           </w:p>
         </w:tc>
@@ -3630,7 +3630,7 @@
               <w:rPr>
                 <w:sz w:val="18"/>
               </w:rPr>
-              <w:t>Техлид</w:t>
+              <w:t>QA-лид</w:t>
             </w:r>
           </w:p>
         </w:tc>
@@ -3653,7 +3653,7 @@
               <w:rPr>
                 <w:sz w:val="18"/>
               </w:rPr>
-              <w:t>23</w:t>
+              <w:t>20</w:t>
             </w:r>
           </w:p>
         </w:tc>
@@ -3674,7 +3674,7 @@
               <w:rPr>
                 <w:sz w:val="18"/>
               </w:rPr>
-              <w:t>ШК-10-05</w:t>
+              <w:t>ШК-10-03</w:t>
             </w:r>
           </w:p>
         </w:tc>
@@ -3695,7 +3695,7 @@
               <w:rPr>
                 <w:sz w:val="18"/>
               </w:rPr>
-              <w:t>Отчёт о завершении этапа 0</w:t>
+              <w:t>Журнал рисков</w:t>
             </w:r>
           </w:p>
         </w:tc>
@@ -3737,7 +3737,7 @@
               <w:rPr>
                 <w:sz w:val="18"/>
               </w:rPr>
-              <w:t>Рабочий</w:t>
+              <w:t>Черновик</w:t>
             </w:r>
           </w:p>
         </w:tc>
@@ -3781,7 +3781,7 @@
               <w:rPr>
                 <w:sz w:val="18"/>
               </w:rPr>
-              <w:t>24</w:t>
+              <w:t>21</w:t>
             </w:r>
           </w:p>
         </w:tc>
@@ -3802,7 +3802,7 @@
               <w:rPr>
                 <w:sz w:val="18"/>
               </w:rPr>
-              <w:t>ШК-10-06</w:t>
+              <w:t>ШК-10-04</w:t>
             </w:r>
           </w:p>
         </w:tc>
@@ -3823,7 +3823,7 @@
               <w:rPr>
                 <w:sz w:val="18"/>
               </w:rPr>
-              <w:t>Отчёт о завершении этапа 1</w:t>
+              <w:t>Журнал изменений</w:t>
             </w:r>
           </w:p>
         </w:tc>
@@ -3844,7 +3844,7 @@
               <w:rPr>
                 <w:sz w:val="18"/>
               </w:rPr>
-              <w:t>0.1</w:t>
+              <w:t>0.5</w:t>
             </w:r>
           </w:p>
         </w:tc>
@@ -3909,7 +3909,7 @@
               <w:rPr>
                 <w:sz w:val="18"/>
               </w:rPr>
-              <w:t>25</w:t>
+              <w:t>22</w:t>
             </w:r>
           </w:p>
         </w:tc>
@@ -3930,7 +3930,7 @@
               <w:rPr>
                 <w:sz w:val="18"/>
               </w:rPr>
-              <w:t>ШК-10-07</w:t>
+              <w:t>ШК-11-01</w:t>
             </w:r>
           </w:p>
         </w:tc>
@@ -3951,7 +3951,7 @@
               <w:rPr>
                 <w:sz w:val="18"/>
               </w:rPr>
-              <w:t>Отчёт о тестировании API LMS</w:t>
+              <w:t>Правила OpenCode и промпты</w:t>
             </w:r>
           </w:p>
         </w:tc>
@@ -3993,7 +3993,7 @@
               <w:rPr>
                 <w:sz w:val="18"/>
               </w:rPr>
-              <w:t>Рабочий</w:t>
+              <w:t>Черновик</w:t>
             </w:r>
           </w:p>
         </w:tc>
@@ -4014,7 +4014,7 @@
               <w:rPr>
                 <w:sz w:val="18"/>
               </w:rPr>
-              <w:t>QA-лид</w:t>
+              <w:t>Техлид</w:t>
             </w:r>
           </w:p>
         </w:tc>
@@ -4037,7 +4037,7 @@
               <w:rPr>
                 <w:sz w:val="18"/>
               </w:rPr>
-              <w:t>26</w:t>
+              <w:t>23</w:t>
             </w:r>
           </w:p>
         </w:tc>
@@ -4058,7 +4058,7 @@
               <w:rPr>
                 <w:sz w:val="18"/>
               </w:rPr>
-              <w:t>ШК-10-08</w:t>
+              <w:t>ШК-10-05</w:t>
             </w:r>
           </w:p>
         </w:tc>
@@ -4079,7 +4079,7 @@
               <w:rPr>
                 <w:sz w:val="18"/>
               </w:rPr>
-              <w:t>Отчёт о тестировании API assessment</w:t>
+              <w:t>Отчёт о завершении этапа 0</w:t>
             </w:r>
           </w:p>
         </w:tc>
@@ -4142,7 +4142,7 @@
               <w:rPr>
                 <w:sz w:val="18"/>
               </w:rPr>
-              <w:t>QA-лид</w:t>
+              <w:t>РП</w:t>
             </w:r>
           </w:p>
         </w:tc>
@@ -4165,7 +4165,7 @@
               <w:rPr>
                 <w:sz w:val="18"/>
               </w:rPr>
-              <w:t>27</w:t>
+              <w:t>24</w:t>
             </w:r>
           </w:p>
         </w:tc>
@@ -4186,7 +4186,7 @@
               <w:rPr>
                 <w:sz w:val="18"/>
               </w:rPr>
-              <w:t>ШК-10-09</w:t>
+              <w:t>ШК-10-06</w:t>
             </w:r>
           </w:p>
         </w:tc>
@@ -4207,7 +4207,519 @@
               <w:rPr>
                 <w:sz w:val="18"/>
               </w:rPr>
+              <w:t>Отчёт о завершении этапа 1</w:t>
+            </w:r>
+          </w:p>
+        </w:tc>
+        <w:tc>
+          <w:tcPr>
+            <w:tcW w:type="dxa" w:w="1662"/>
+          </w:tcPr>
+          <w:p>
+            <w:pPr>
+              <w:spacing w:after="20"/>
+            </w:pPr>
+            <w:r>
+              <w:rPr>
+                <w:sz w:val="18"/>
+              </w:rPr>
+            </w:r>
+            <w:r>
+              <w:rPr>
+                <w:sz w:val="18"/>
+              </w:rPr>
+              <w:t>0.1</w:t>
+            </w:r>
+          </w:p>
+        </w:tc>
+        <w:tc>
+          <w:tcPr>
+            <w:tcW w:type="dxa" w:w="1662"/>
+          </w:tcPr>
+          <w:p>
+            <w:pPr>
+              <w:spacing w:after="20"/>
+            </w:pPr>
+            <w:r>
+              <w:rPr>
+                <w:sz w:val="18"/>
+              </w:rPr>
+            </w:r>
+            <w:r>
+              <w:rPr>
+                <w:sz w:val="18"/>
+              </w:rPr>
+              <w:t>Рабочий</w:t>
+            </w:r>
+          </w:p>
+        </w:tc>
+        <w:tc>
+          <w:tcPr>
+            <w:tcW w:type="dxa" w:w="1662"/>
+          </w:tcPr>
+          <w:p>
+            <w:pPr>
+              <w:spacing w:after="20"/>
+            </w:pPr>
+            <w:r>
+              <w:rPr>
+                <w:sz w:val="18"/>
+              </w:rPr>
+            </w:r>
+            <w:r>
+              <w:rPr>
+                <w:sz w:val="18"/>
+              </w:rPr>
+              <w:t>РП</w:t>
+            </w:r>
+          </w:p>
+        </w:tc>
+      </w:tr>
+      <w:tr>
+        <w:tc>
+          <w:tcPr>
+            <w:tcW w:type="dxa" w:w="1662"/>
+          </w:tcPr>
+          <w:p>
+            <w:pPr>
+              <w:spacing w:after="20"/>
+            </w:pPr>
+            <w:r>
+              <w:rPr>
+                <w:sz w:val="18"/>
+              </w:rPr>
+            </w:r>
+            <w:r>
+              <w:rPr>
+                <w:sz w:val="18"/>
+              </w:rPr>
+              <w:t>25</w:t>
+            </w:r>
+          </w:p>
+        </w:tc>
+        <w:tc>
+          <w:tcPr>
+            <w:tcW w:type="dxa" w:w="1662"/>
+          </w:tcPr>
+          <w:p>
+            <w:pPr>
+              <w:spacing w:after="20"/>
+            </w:pPr>
+            <w:r>
+              <w:rPr>
+                <w:sz w:val="18"/>
+              </w:rPr>
+            </w:r>
+            <w:r>
+              <w:rPr>
+                <w:sz w:val="18"/>
+              </w:rPr>
+              <w:t>ШК-10-07</w:t>
+            </w:r>
+          </w:p>
+        </w:tc>
+        <w:tc>
+          <w:tcPr>
+            <w:tcW w:type="dxa" w:w="1662"/>
+          </w:tcPr>
+          <w:p>
+            <w:pPr>
+              <w:spacing w:after="20"/>
+            </w:pPr>
+            <w:r>
+              <w:rPr>
+                <w:sz w:val="18"/>
+              </w:rPr>
+            </w:r>
+            <w:r>
+              <w:rPr>
+                <w:sz w:val="18"/>
+              </w:rPr>
+              <w:t>Отчёт о тестировании API LMS</w:t>
+            </w:r>
+          </w:p>
+        </w:tc>
+        <w:tc>
+          <w:tcPr>
+            <w:tcW w:type="dxa" w:w="1662"/>
+          </w:tcPr>
+          <w:p>
+            <w:pPr>
+              <w:spacing w:after="20"/>
+            </w:pPr>
+            <w:r>
+              <w:rPr>
+                <w:sz w:val="18"/>
+              </w:rPr>
+            </w:r>
+            <w:r>
+              <w:rPr>
+                <w:sz w:val="18"/>
+              </w:rPr>
+              <w:t>0.1</w:t>
+            </w:r>
+          </w:p>
+        </w:tc>
+        <w:tc>
+          <w:tcPr>
+            <w:tcW w:type="dxa" w:w="1662"/>
+          </w:tcPr>
+          <w:p>
+            <w:pPr>
+              <w:spacing w:after="20"/>
+            </w:pPr>
+            <w:r>
+              <w:rPr>
+                <w:sz w:val="18"/>
+              </w:rPr>
+            </w:r>
+            <w:r>
+              <w:rPr>
+                <w:sz w:val="18"/>
+              </w:rPr>
+              <w:t>Рабочий</w:t>
+            </w:r>
+          </w:p>
+        </w:tc>
+        <w:tc>
+          <w:tcPr>
+            <w:tcW w:type="dxa" w:w="1662"/>
+          </w:tcPr>
+          <w:p>
+            <w:pPr>
+              <w:spacing w:after="20"/>
+            </w:pPr>
+            <w:r>
+              <w:rPr>
+                <w:sz w:val="18"/>
+              </w:rPr>
+            </w:r>
+            <w:r>
+              <w:rPr>
+                <w:sz w:val="18"/>
+              </w:rPr>
+              <w:t>QA-лид</w:t>
+            </w:r>
+          </w:p>
+        </w:tc>
+      </w:tr>
+      <w:tr>
+        <w:tc>
+          <w:tcPr>
+            <w:tcW w:type="dxa" w:w="1662"/>
+          </w:tcPr>
+          <w:p>
+            <w:pPr>
+              <w:spacing w:after="20"/>
+            </w:pPr>
+            <w:r>
+              <w:rPr>
+                <w:sz w:val="18"/>
+              </w:rPr>
+            </w:r>
+            <w:r>
+              <w:rPr>
+                <w:sz w:val="18"/>
+              </w:rPr>
+              <w:t>26</w:t>
+            </w:r>
+          </w:p>
+        </w:tc>
+        <w:tc>
+          <w:tcPr>
+            <w:tcW w:type="dxa" w:w="1662"/>
+          </w:tcPr>
+          <w:p>
+            <w:pPr>
+              <w:spacing w:after="20"/>
+            </w:pPr>
+            <w:r>
+              <w:rPr>
+                <w:sz w:val="18"/>
+              </w:rPr>
+            </w:r>
+            <w:r>
+              <w:rPr>
+                <w:sz w:val="18"/>
+              </w:rPr>
+              <w:t>ШК-10-08</w:t>
+            </w:r>
+          </w:p>
+        </w:tc>
+        <w:tc>
+          <w:tcPr>
+            <w:tcW w:type="dxa" w:w="1662"/>
+          </w:tcPr>
+          <w:p>
+            <w:pPr>
+              <w:spacing w:after="20"/>
+            </w:pPr>
+            <w:r>
+              <w:rPr>
+                <w:sz w:val="18"/>
+              </w:rPr>
+            </w:r>
+            <w:r>
+              <w:rPr>
+                <w:sz w:val="18"/>
+              </w:rPr>
+              <w:t>Отчёт о тестировании API assessment</w:t>
+            </w:r>
+          </w:p>
+        </w:tc>
+        <w:tc>
+          <w:tcPr>
+            <w:tcW w:type="dxa" w:w="1662"/>
+          </w:tcPr>
+          <w:p>
+            <w:pPr>
+              <w:spacing w:after="20"/>
+            </w:pPr>
+            <w:r>
+              <w:rPr>
+                <w:sz w:val="18"/>
+              </w:rPr>
+            </w:r>
+            <w:r>
+              <w:rPr>
+                <w:sz w:val="18"/>
+              </w:rPr>
+              <w:t>0.1</w:t>
+            </w:r>
+          </w:p>
+        </w:tc>
+        <w:tc>
+          <w:tcPr>
+            <w:tcW w:type="dxa" w:w="1662"/>
+          </w:tcPr>
+          <w:p>
+            <w:pPr>
+              <w:spacing w:after="20"/>
+            </w:pPr>
+            <w:r>
+              <w:rPr>
+                <w:sz w:val="18"/>
+              </w:rPr>
+            </w:r>
+            <w:r>
+              <w:rPr>
+                <w:sz w:val="18"/>
+              </w:rPr>
+              <w:t>Рабочий</w:t>
+            </w:r>
+          </w:p>
+        </w:tc>
+        <w:tc>
+          <w:tcPr>
+            <w:tcW w:type="dxa" w:w="1662"/>
+          </w:tcPr>
+          <w:p>
+            <w:pPr>
+              <w:spacing w:after="20"/>
+            </w:pPr>
+            <w:r>
+              <w:rPr>
+                <w:sz w:val="18"/>
+              </w:rPr>
+            </w:r>
+            <w:r>
+              <w:rPr>
+                <w:sz w:val="18"/>
+              </w:rPr>
+              <w:t>QA-лид</w:t>
+            </w:r>
+          </w:p>
+        </w:tc>
+      </w:tr>
+      <w:tr>
+        <w:tc>
+          <w:tcPr>
+            <w:tcW w:type="dxa" w:w="1662"/>
+          </w:tcPr>
+          <w:p>
+            <w:pPr>
+              <w:spacing w:after="20"/>
+            </w:pPr>
+            <w:r>
+              <w:rPr>
+                <w:sz w:val="18"/>
+              </w:rPr>
+            </w:r>
+            <w:r>
+              <w:rPr>
+                <w:sz w:val="18"/>
+              </w:rPr>
+              <w:t>27</w:t>
+            </w:r>
+          </w:p>
+        </w:tc>
+        <w:tc>
+          <w:tcPr>
+            <w:tcW w:type="dxa" w:w="1662"/>
+          </w:tcPr>
+          <w:p>
+            <w:pPr>
+              <w:spacing w:after="20"/>
+            </w:pPr>
+            <w:r>
+              <w:rPr>
+                <w:sz w:val="18"/>
+              </w:rPr>
+            </w:r>
+            <w:r>
+              <w:rPr>
+                <w:sz w:val="18"/>
+              </w:rPr>
+              <w:t>ШК-10-09</w:t>
+            </w:r>
+          </w:p>
+        </w:tc>
+        <w:tc>
+          <w:tcPr>
+            <w:tcW w:type="dxa" w:w="1662"/>
+          </w:tcPr>
+          <w:p>
+            <w:pPr>
+              <w:spacing w:after="20"/>
+            </w:pPr>
+            <w:r>
+              <w:rPr>
+                <w:sz w:val="18"/>
+              </w:rPr>
+            </w:r>
+            <w:r>
+              <w:rPr>
+                <w:sz w:val="18"/>
+              </w:rPr>
               <w:t>Отчёт о тестировании API journal</w:t>
+            </w:r>
+          </w:p>
+        </w:tc>
+        <w:tc>
+          <w:tcPr>
+            <w:tcW w:type="dxa" w:w="1662"/>
+          </w:tcPr>
+          <w:p>
+            <w:pPr>
+              <w:spacing w:after="20"/>
+            </w:pPr>
+            <w:r>
+              <w:rPr>
+                <w:sz w:val="18"/>
+              </w:rPr>
+            </w:r>
+            <w:r>
+              <w:rPr>
+                <w:sz w:val="18"/>
+              </w:rPr>
+              <w:t>0.1</w:t>
+            </w:r>
+          </w:p>
+        </w:tc>
+        <w:tc>
+          <w:tcPr>
+            <w:tcW w:type="dxa" w:w="1662"/>
+          </w:tcPr>
+          <w:p>
+            <w:pPr>
+              <w:spacing w:after="20"/>
+            </w:pPr>
+            <w:r>
+              <w:rPr>
+                <w:sz w:val="18"/>
+              </w:rPr>
+            </w:r>
+            <w:r>
+              <w:rPr>
+                <w:sz w:val="18"/>
+              </w:rPr>
+              <w:t>Рабочий</w:t>
+            </w:r>
+          </w:p>
+        </w:tc>
+        <w:tc>
+          <w:tcPr>
+            <w:tcW w:type="dxa" w:w="1662"/>
+          </w:tcPr>
+          <w:p>
+            <w:pPr>
+              <w:spacing w:after="20"/>
+            </w:pPr>
+            <w:r>
+              <w:rPr>
+                <w:sz w:val="18"/>
+              </w:rPr>
+            </w:r>
+            <w:r>
+              <w:rPr>
+                <w:sz w:val="18"/>
+              </w:rPr>
+              <w:t>QA-лид</w:t>
+            </w:r>
+          </w:p>
+        </w:tc>
+      </w:tr>
+      <w:tr>
+        <w:tc>
+          <w:tcPr>
+            <w:tcW w:type="dxa" w:w="1662"/>
+          </w:tcPr>
+          <w:p>
+            <w:pPr>
+              <w:spacing w:after="20"/>
+            </w:pPr>
+            <w:r>
+              <w:rPr>
+                <w:sz w:val="18"/>
+              </w:rPr>
+            </w:r>
+            <w:r>
+              <w:rPr>
+                <w:sz w:val="18"/>
+              </w:rPr>
+              <w:t>28</w:t>
+            </w:r>
+          </w:p>
+        </w:tc>
+        <w:tc>
+          <w:tcPr>
+            <w:tcW w:type="dxa" w:w="1662"/>
+          </w:tcPr>
+          <w:p>
+            <w:pPr>
+              <w:spacing w:after="20"/>
+            </w:pPr>
+            <w:r>
+              <w:rPr>
+                <w:sz w:val="18"/>
+              </w:rPr>
+            </w:r>
+            <w:r>
+              <w:rPr>
+                <w:sz w:val="18"/>
+              </w:rPr>
+              <w:t>ШК-10-10</w:t>
+            </w:r>
+          </w:p>
+        </w:tc>
+        <w:tc>
+          <w:tcPr>
+            <w:tcW w:type="dxa" w:w="1662"/>
+          </w:tcPr>
+          <w:p>
+            <w:pPr>
+              <w:spacing w:after="20"/>
+            </w:pPr>
+            <w:r>
+              <w:rPr>
+                <w:sz w:val="18"/>
+              </w:rPr>
+            </w:r>
+            <w:r>
+              <w:rPr>
+                <w:sz w:val="18"/>
+              </w:rPr>
+              <w:t>Отчёт о тестировании групп, прав и сервисов</w:t>
             </w:r>
           </w:p>
         </w:tc>
@@ -4439,7 +4951,7 @@
       <w:jc w:val="center"/>
     </w:pPr>
     <w:r>
-      <w:t xml:space="preserve">ЕООП «Школьник» · 0.1 · </w:t>
+      <w:t xml:space="preserve">ЕООП «Школьник» · 0.6 · </w:t>
     </w:r>
     <w:r>
       <w:fldChar w:fldCharType="begin"/>

</xml_diff>

<commit_message>
feat: add React web client and pilot SPA hosting
</commit_message>
<xml_diff>
--- a/docs/word/00-register/01-register-dokumentacii.docx
+++ b/docs/word/00-register/01-register-dokumentacii.docx
@@ -63,7 +63,7 @@
           </w:tcPr>
           <w:p>
             <w:r>
-              <w:t>0.6</w:t>
+              <w:t>0.7</w:t>
             </w:r>
           </w:p>
         </w:tc>
@@ -365,7 +365,7 @@
               <w:rPr>
                 <w:sz w:val="18"/>
               </w:rPr>
-              <w:t>0.6</w:t>
+              <w:t>0.7</w:t>
             </w:r>
           </w:p>
         </w:tc>
@@ -4783,6 +4783,262 @@
                 <w:sz w:val="18"/>
               </w:rPr>
               <w:t>QA-лид</w:t>
+            </w:r>
+          </w:p>
+        </w:tc>
+      </w:tr>
+      <w:tr>
+        <w:tc>
+          <w:tcPr>
+            <w:tcW w:type="dxa" w:w="1662"/>
+          </w:tcPr>
+          <w:p>
+            <w:pPr>
+              <w:spacing w:after="20"/>
+            </w:pPr>
+            <w:r>
+              <w:rPr>
+                <w:sz w:val="18"/>
+              </w:rPr>
+            </w:r>
+            <w:r>
+              <w:rPr>
+                <w:sz w:val="18"/>
+              </w:rPr>
+              <w:t>29</w:t>
+            </w:r>
+          </w:p>
+        </w:tc>
+        <w:tc>
+          <w:tcPr>
+            <w:tcW w:type="dxa" w:w="1662"/>
+          </w:tcPr>
+          <w:p>
+            <w:pPr>
+              <w:spacing w:after="20"/>
+            </w:pPr>
+            <w:r>
+              <w:rPr>
+                <w:sz w:val="18"/>
+              </w:rPr>
+            </w:r>
+            <w:r>
+              <w:rPr>
+                <w:sz w:val="18"/>
+              </w:rPr>
+              <w:t>ШК-03-06</w:t>
+            </w:r>
+          </w:p>
+        </w:tc>
+        <w:tc>
+          <w:tcPr>
+            <w:tcW w:type="dxa" w:w="1662"/>
+          </w:tcPr>
+          <w:p>
+            <w:pPr>
+              <w:spacing w:after="20"/>
+            </w:pPr>
+            <w:r>
+              <w:rPr>
+                <w:sz w:val="18"/>
+              </w:rPr>
+            </w:r>
+            <w:r>
+              <w:rPr>
+                <w:sz w:val="18"/>
+              </w:rPr>
+              <w:t>Веб-клиент и личный кабинет</w:t>
+            </w:r>
+          </w:p>
+        </w:tc>
+        <w:tc>
+          <w:tcPr>
+            <w:tcW w:type="dxa" w:w="1662"/>
+          </w:tcPr>
+          <w:p>
+            <w:pPr>
+              <w:spacing w:after="20"/>
+            </w:pPr>
+            <w:r>
+              <w:rPr>
+                <w:sz w:val="18"/>
+              </w:rPr>
+            </w:r>
+            <w:r>
+              <w:rPr>
+                <w:sz w:val="18"/>
+              </w:rPr>
+              <w:t>1.0</w:t>
+            </w:r>
+          </w:p>
+        </w:tc>
+        <w:tc>
+          <w:tcPr>
+            <w:tcW w:type="dxa" w:w="1662"/>
+          </w:tcPr>
+          <w:p>
+            <w:pPr>
+              <w:spacing w:after="20"/>
+            </w:pPr>
+            <w:r>
+              <w:rPr>
+                <w:sz w:val="18"/>
+              </w:rPr>
+            </w:r>
+            <w:r>
+              <w:rPr>
+                <w:sz w:val="18"/>
+              </w:rPr>
+              <w:t>Рабочий</w:t>
+            </w:r>
+          </w:p>
+        </w:tc>
+        <w:tc>
+          <w:tcPr>
+            <w:tcW w:type="dxa" w:w="1662"/>
+          </w:tcPr>
+          <w:p>
+            <w:pPr>
+              <w:spacing w:after="20"/>
+            </w:pPr>
+            <w:r>
+              <w:rPr>
+                <w:sz w:val="18"/>
+              </w:rPr>
+            </w:r>
+            <w:r>
+              <w:rPr>
+                <w:sz w:val="18"/>
+              </w:rPr>
+              <w:t>Архитектор</w:t>
+            </w:r>
+          </w:p>
+        </w:tc>
+      </w:tr>
+      <w:tr>
+        <w:tc>
+          <w:tcPr>
+            <w:tcW w:type="dxa" w:w="1662"/>
+          </w:tcPr>
+          <w:p>
+            <w:pPr>
+              <w:spacing w:after="20"/>
+            </w:pPr>
+            <w:r>
+              <w:rPr>
+                <w:sz w:val="18"/>
+              </w:rPr>
+            </w:r>
+            <w:r>
+              <w:rPr>
+                <w:sz w:val="18"/>
+              </w:rPr>
+              <w:t>30</w:t>
+            </w:r>
+          </w:p>
+        </w:tc>
+        <w:tc>
+          <w:tcPr>
+            <w:tcW w:type="dxa" w:w="1662"/>
+          </w:tcPr>
+          <w:p>
+            <w:pPr>
+              <w:spacing w:after="20"/>
+            </w:pPr>
+            <w:r>
+              <w:rPr>
+                <w:sz w:val="18"/>
+              </w:rPr>
+            </w:r>
+            <w:r>
+              <w:rPr>
+                <w:sz w:val="18"/>
+              </w:rPr>
+              <w:t>ШК-10-11</w:t>
+            </w:r>
+          </w:p>
+        </w:tc>
+        <w:tc>
+          <w:tcPr>
+            <w:tcW w:type="dxa" w:w="1662"/>
+          </w:tcPr>
+          <w:p>
+            <w:pPr>
+              <w:spacing w:after="20"/>
+            </w:pPr>
+            <w:r>
+              <w:rPr>
+                <w:sz w:val="18"/>
+              </w:rPr>
+            </w:r>
+            <w:r>
+              <w:rPr>
+                <w:sz w:val="18"/>
+              </w:rPr>
+              <w:t>Отчёт о тестировании веб-клиента</w:t>
+            </w:r>
+          </w:p>
+        </w:tc>
+        <w:tc>
+          <w:tcPr>
+            <w:tcW w:type="dxa" w:w="1662"/>
+          </w:tcPr>
+          <w:p>
+            <w:pPr>
+              <w:spacing w:after="20"/>
+            </w:pPr>
+            <w:r>
+              <w:rPr>
+                <w:sz w:val="18"/>
+              </w:rPr>
+            </w:r>
+            <w:r>
+              <w:rPr>
+                <w:sz w:val="18"/>
+              </w:rPr>
+              <w:t>0.1</w:t>
+            </w:r>
+          </w:p>
+        </w:tc>
+        <w:tc>
+          <w:tcPr>
+            <w:tcW w:type="dxa" w:w="1662"/>
+          </w:tcPr>
+          <w:p>
+            <w:pPr>
+              <w:spacing w:after="20"/>
+            </w:pPr>
+            <w:r>
+              <w:rPr>
+                <w:sz w:val="18"/>
+              </w:rPr>
+            </w:r>
+            <w:r>
+              <w:rPr>
+                <w:sz w:val="18"/>
+              </w:rPr>
+              <w:t>Рабочий</w:t>
+            </w:r>
+          </w:p>
+        </w:tc>
+        <w:tc>
+          <w:tcPr>
+            <w:tcW w:type="dxa" w:w="1662"/>
+          </w:tcPr>
+          <w:p>
+            <w:pPr>
+              <w:spacing w:after="20"/>
+            </w:pPr>
+            <w:r>
+              <w:rPr>
+                <w:sz w:val="18"/>
+              </w:rPr>
+            </w:r>
+            <w:r>
+              <w:rPr>
+                <w:sz w:val="18"/>
+              </w:rPr>
+              <w:t>QA-группа</w:t>
             </w:r>
           </w:p>
         </w:tc>
@@ -4951,7 +5207,7 @@
       <w:jc w:val="center"/>
     </w:pPr>
     <w:r>
-      <w:t xml:space="preserve">ЕООП «Школьник» · 0.6 · </w:t>
+      <w:t xml:space="preserve">ЕООП «Школьник» · 0.7 · </w:t>
     </w:r>
     <w:r>
       <w:fldChar w:fldCharType="begin"/>

</xml_diff>

<commit_message>
docs: publish pilot on school-platform-v2.alwaysdata.net
Document the new Alwaysdata profile, reused PostgreSQL database, Python WSGI/a2wsgi entrypoint and verification results. Refresh the documentation package to 0.7.1.
</commit_message>
<xml_diff>
--- a/docs/word/00-register/01-register-dokumentacii.docx
+++ b/docs/word/00-register/01-register-dokumentacii.docx
@@ -63,7 +63,7 @@
           </w:tcPr>
           <w:p>
             <w:r>
-              <w:t>0.7</w:t>
+              <w:t>0.7.1</w:t>
             </w:r>
           </w:p>
         </w:tc>
@@ -365,7 +365,7 @@
               <w:rPr>
                 <w:sz w:val="18"/>
               </w:rPr>
-              <w:t>0.7</w:t>
+              <w:t>0.7.1</w:t>
             </w:r>
           </w:p>
         </w:tc>
@@ -772,7 +772,7 @@
               <w:rPr>
                 <w:sz w:val="18"/>
               </w:rPr>
-              <w:t>0.1</w:t>
+              <w:t>0.7.1</w:t>
             </w:r>
           </w:p>
         </w:tc>
@@ -793,7 +793,7 @@
               <w:rPr>
                 <w:sz w:val="18"/>
               </w:rPr>
-              <w:t>Черновик</w:t>
+              <w:t>Рабочий</w:t>
             </w:r>
           </w:p>
         </w:tc>
@@ -1924,7 +1924,7 @@
               <w:rPr>
                 <w:sz w:val="18"/>
               </w:rPr>
-              <w:t>0.4</w:t>
+              <w:t>0.7</w:t>
             </w:r>
           </w:p>
         </w:tc>
@@ -2948,7 +2948,7 @@
               <w:rPr>
                 <w:sz w:val="18"/>
               </w:rPr>
-              <w:t>0.1</w:t>
+              <w:t>0.4</w:t>
             </w:r>
           </w:p>
         </w:tc>
@@ -2969,7 +2969,7 @@
               <w:rPr>
                 <w:sz w:val="18"/>
               </w:rPr>
-              <w:t>Черновик</w:t>
+              <w:t>Рабочий</w:t>
             </w:r>
           </w:p>
         </w:tc>
@@ -3844,7 +3844,7 @@
               <w:rPr>
                 <w:sz w:val="18"/>
               </w:rPr>
-              <w:t>0.5</w:t>
+              <w:t>0.7</w:t>
             </w:r>
           </w:p>
         </w:tc>
@@ -5207,7 +5207,7 @@
       <w:jc w:val="center"/>
     </w:pPr>
     <w:r>
-      <w:t xml:space="preserve">ЕООП «Школьник» · 0.7 · </w:t>
+      <w:t xml:space="preserve">ЕООП «Школьник» · 0.7.1 · </w:t>
     </w:r>
     <w:r>
       <w:fldChar w:fldCharType="begin"/>

</xml_diff>

<commit_message>
feat(access): enforce service and permission checks in modules
Journal, assessment, library and LMS routers now require an enabled service and a matching group permission. Parents receive assessment.results.read. Add route-level tests for disabled services and missing permissions, refresh docs to 0.7.2.
</commit_message>
<xml_diff>
--- a/docs/word/00-register/01-register-dokumentacii.docx
+++ b/docs/word/00-register/01-register-dokumentacii.docx
@@ -63,7 +63,7 @@
           </w:tcPr>
           <w:p>
             <w:r>
-              <w:t>0.7.1</w:t>
+              <w:t>0.7.2</w:t>
             </w:r>
           </w:p>
         </w:tc>
@@ -365,7 +365,7 @@
               <w:rPr>
                 <w:sz w:val="18"/>
               </w:rPr>
-              <w:t>0.7.1</w:t>
+              <w:t>0.7.2</w:t>
             </w:r>
           </w:p>
         </w:tc>
@@ -772,7 +772,7 @@
               <w:rPr>
                 <w:sz w:val="18"/>
               </w:rPr>
-              <w:t>0.7.1</w:t>
+              <w:t>0.7.2</w:t>
             </w:r>
           </w:p>
         </w:tc>
@@ -5207,7 +5207,7 @@
       <w:jc w:val="center"/>
     </w:pPr>
     <w:r>
-      <w:t xml:space="preserve">ЕООП «Школьник» · 0.7.1 · </w:t>
+      <w:t xml:space="preserve">ЕООП «Школьник» · 0.7.2 · </w:t>
     </w:r>
     <w:r>
       <w:fldChar w:fldCharType="begin"/>

</xml_diff>

<commit_message>
docs: correct Alwaysdata restart procedure
Restart is on the site page or triggered by saving Environment, not in Advanced/Processes. Record live verification after uWSGI restart and refresh the documentation package to 0.7.3.
</commit_message>
<xml_diff>
--- a/docs/word/00-register/01-register-dokumentacii.docx
+++ b/docs/word/00-register/01-register-dokumentacii.docx
@@ -63,7 +63,7 @@
           </w:tcPr>
           <w:p>
             <w:r>
-              <w:t>0.7.2</w:t>
+              <w:t>0.7.3</w:t>
             </w:r>
           </w:p>
         </w:tc>
@@ -365,7 +365,7 @@
               <w:rPr>
                 <w:sz w:val="18"/>
               </w:rPr>
-              <w:t>0.7.2</w:t>
+              <w:t>0.7.3</w:t>
             </w:r>
           </w:p>
         </w:tc>
@@ -772,7 +772,7 @@
               <w:rPr>
                 <w:sz w:val="18"/>
               </w:rPr>
-              <w:t>0.7.2</w:t>
+              <w:t>0.7.3</w:t>
             </w:r>
           </w:p>
         </w:tc>
@@ -2948,7 +2948,7 @@
               <w:rPr>
                 <w:sz w:val="18"/>
               </w:rPr>
-              <w:t>0.4</w:t>
+              <w:t>0.5</w:t>
             </w:r>
           </w:p>
         </w:tc>
@@ -5207,7 +5207,7 @@
       <w:jc w:val="center"/>
     </w:pPr>
     <w:r>
-      <w:t xml:space="preserve">ЕООП «Школьник» · 0.7.2 · </w:t>
+      <w:t xml:space="preserve">ЕООП «Школьник» · 0.7.3 · </w:t>
     </w:r>
     <w:r>
       <w:fldChar w:fldCharType="begin"/>

</xml_diff>